<commit_message>
Align greybox flow to Demo story design v1.1 and refresh design docs.
Replace v1.0 story/art PDFs with v1.1, complete acts 1-4 plus diary night, and fix early interaction/layout issues (bed lock, seal after coffin, 2B doors).

Co-authored-by: Cursor <cursoragent@cursor.com>
</commit_message>
<xml_diff>
--- a/项目协作说明_v3.1.docx
+++ b/项目协作说明_v3.1.docx
@@ -28,7 +28,7 @@
         <w:tblLayout w:type="fixed"/>
       </w:tblPr>
       <w:tblGrid>
-        <w:gridCol w:w="100"/>
+        <w:gridCol w:w="11906"/>
       </w:tblGrid>
       <w:tr>
         <w:trPr>
@@ -2570,9 +2570,9 @@
         <w:tblLayout w:type="fixed"/>
       </w:tblPr>
       <w:tblGrid>
-        <w:gridCol w:w="100"/>
-        <w:gridCol w:w="100"/>
-        <w:gridCol w:w="100"/>
+        <w:gridCol w:w="1620"/>
+        <w:gridCol w:w="4230"/>
+        <w:gridCol w:w="3150"/>
       </w:tblGrid>
       <w:tr>
         <w:trPr>

</xml_diff>